<commit_message>
docs: resolve feedbacks e adiciona validacao do Miguel na task M01
</commit_message>
<xml_diff>
--- a/docs/CAPITU_Documentacao_Padrao_e_Plano_de_Testes.docx
+++ b/docs/CAPITU_Documentacao_Padrao_e_Plano_de_Testes.docx
@@ -16397,6 +16397,7 @@
             <w:pPr>
               <w:spacing w:before="20" w:after="20"/>
             </w:pPr>
+            <w:proofErr w:type="spellStart"/>
             <w:r>
               <w:rPr>
                 <w:b/>
@@ -16405,6 +16406,7 @@
               </w:rPr>
               <w:t>Coluna</w:t>
             </w:r>
+            <w:proofErr w:type="spellEnd"/>
           </w:p>
         </w:tc>
         <w:tc>
@@ -17078,8 +17080,16 @@
               <w:rPr>
                 <w:sz w:val="16"/>
               </w:rPr>
-              <w:t>GATE-A Planejamento</w:t>
-            </w:r>
+              <w:t xml:space="preserve">GATE-A </w:t>
+            </w:r>
+            <w:proofErr w:type="spellStart"/>
+            <w:r>
+              <w:rPr>
+                <w:sz w:val="16"/>
+              </w:rPr>
+              <w:t>Planejamento</w:t>
+            </w:r>
+            <w:proofErr w:type="spellEnd"/>
           </w:p>
         </w:tc>
         <w:tc>
@@ -17442,15 +17452,1398 @@
     </w:p>
     <w:p>
       <w:r>
-        <w:t>Um gate que falhe não deve ser ocultado. Registrar o que bloqueia, quem resolve e data; a ausência de teste executado não equivale a aprovado. Resultados e meta interna devem ser reportados mesmo se abaixo de 85%.</w:t>
+        <w:t xml:space="preserve">Um gate que falhe não deve ser ocultado. Registrar o que bloqueia, quem resolve e data; a ausência de teste executado não equivale a aprovado. Resultados e meta interna devem ser reportados mesmo se </w:t>
+      </w:r>
+      <w:proofErr w:type="spellStart"/>
+      <w:r>
+        <w:t>abaixo</w:t>
+      </w:r>
+      <w:proofErr w:type="spellEnd"/>
+      <w:r>
+        <w:t xml:space="preserve"> de 85%.</w:t>
       </w:r>
     </w:p>
+    <w:p/>
+    <w:p/>
+    <w:p>
+      <w:pPr>
+        <w:rPr>
+          <w:rFonts w:asciiTheme="majorHAnsi" w:hAnsiTheme="majorHAnsi" w:cstheme="majorHAnsi"/>
+          <w:sz w:val="30"/>
+          <w:szCs w:val="30"/>
+          <w:lang w:val="pt-BR"/>
+        </w:rPr>
+      </w:pPr>
+      <w:r>
+        <w:rPr>
+          <w:rFonts w:asciiTheme="majorHAnsi" w:hAnsiTheme="majorHAnsi" w:cstheme="majorHAnsi"/>
+          <w:b/>
+          <w:bCs/>
+          <w:sz w:val="30"/>
+          <w:szCs w:val="30"/>
+          <w:lang w:val="pt-BR"/>
+        </w:rPr>
+        <w:t xml:space="preserve">16. </w:t>
+      </w:r>
+      <w:r>
+        <w:rPr>
+          <w:rFonts w:asciiTheme="majorHAnsi" w:hAnsiTheme="majorHAnsi" w:cstheme="majorHAnsi"/>
+          <w:b/>
+          <w:bCs/>
+          <w:sz w:val="30"/>
+          <w:szCs w:val="30"/>
+          <w:lang w:val="pt-BR"/>
+        </w:rPr>
+        <w:t>Limites do Sistema (Fora do Escopo)</w:t>
+      </w:r>
+    </w:p>
+    <w:p>
+      <w:pPr>
+        <w:numPr>
+          <w:ilvl w:val="0"/>
+          <w:numId w:val="10"/>
+        </w:numPr>
+        <w:rPr>
+          <w:lang w:val="pt-BR"/>
+        </w:rPr>
+      </w:pPr>
+      <w:r>
+        <w:rPr>
+          <w:lang w:val="pt-BR"/>
+        </w:rPr>
+        <w:t>Não realiza recomendações personalizadas por perfil do aluno.</w:t>
+      </w:r>
+    </w:p>
+    <w:p>
+      <w:pPr>
+        <w:numPr>
+          <w:ilvl w:val="0"/>
+          <w:numId w:val="10"/>
+        </w:numPr>
+        <w:rPr>
+          <w:lang w:val="pt-BR"/>
+        </w:rPr>
+      </w:pPr>
+      <w:r>
+        <w:rPr>
+          <w:lang w:val="pt-BR"/>
+        </w:rPr>
+        <w:t>Não verifica disponibilidade de exemplares físicos, empréstimos, multas ou reservas.</w:t>
+      </w:r>
+    </w:p>
+    <w:p>
+      <w:pPr>
+        <w:numPr>
+          <w:ilvl w:val="0"/>
+          <w:numId w:val="10"/>
+        </w:numPr>
+        <w:rPr>
+          <w:lang w:val="pt-BR"/>
+        </w:rPr>
+      </w:pPr>
+      <w:r>
+        <w:rPr>
+          <w:lang w:val="pt-BR"/>
+        </w:rPr>
+        <w:lastRenderedPageBreak/>
+        <w:t>Consultas bibliográficas somente leitura, sem ações externas.</w:t>
+      </w:r>
+    </w:p>
+    <w:p/>
+    <w:p>
+      <w:pPr>
+        <w:rPr>
+          <w:sz w:val="30"/>
+          <w:szCs w:val="30"/>
+        </w:rPr>
+      </w:pPr>
+    </w:p>
+    <w:p>
+      <w:pPr>
+        <w:rPr>
+          <w:rFonts w:asciiTheme="majorHAnsi" w:hAnsiTheme="majorHAnsi" w:cstheme="majorHAnsi"/>
+          <w:b/>
+          <w:bCs/>
+          <w:sz w:val="30"/>
+          <w:szCs w:val="30"/>
+        </w:rPr>
+      </w:pPr>
+      <w:r>
+        <w:rPr>
+          <w:rFonts w:asciiTheme="majorHAnsi" w:hAnsiTheme="majorHAnsi" w:cstheme="majorHAnsi"/>
+          <w:b/>
+          <w:bCs/>
+          <w:sz w:val="30"/>
+          <w:szCs w:val="30"/>
+        </w:rPr>
+        <w:t xml:space="preserve">17. </w:t>
+      </w:r>
+      <w:proofErr w:type="spellStart"/>
+      <w:r>
+        <w:rPr>
+          <w:rFonts w:asciiTheme="majorHAnsi" w:hAnsiTheme="majorHAnsi" w:cstheme="majorHAnsi"/>
+          <w:b/>
+          <w:bCs/>
+          <w:sz w:val="30"/>
+          <w:szCs w:val="30"/>
+        </w:rPr>
+        <w:t>Fluxos</w:t>
+      </w:r>
+      <w:proofErr w:type="spellEnd"/>
+      <w:r>
+        <w:rPr>
+          <w:rFonts w:asciiTheme="majorHAnsi" w:hAnsiTheme="majorHAnsi" w:cstheme="majorHAnsi"/>
+          <w:b/>
+          <w:bCs/>
+          <w:sz w:val="30"/>
+          <w:szCs w:val="30"/>
+        </w:rPr>
+        <w:t xml:space="preserve"> de </w:t>
+      </w:r>
+      <w:proofErr w:type="spellStart"/>
+      <w:r>
+        <w:rPr>
+          <w:rFonts w:asciiTheme="majorHAnsi" w:hAnsiTheme="majorHAnsi" w:cstheme="majorHAnsi"/>
+          <w:b/>
+          <w:bCs/>
+          <w:sz w:val="30"/>
+          <w:szCs w:val="30"/>
+        </w:rPr>
+        <w:t>Interação</w:t>
+      </w:r>
+      <w:proofErr w:type="spellEnd"/>
+      <w:r>
+        <w:rPr>
+          <w:rFonts w:asciiTheme="majorHAnsi" w:hAnsiTheme="majorHAnsi" w:cstheme="majorHAnsi"/>
+          <w:b/>
+          <w:bCs/>
+          <w:sz w:val="30"/>
+          <w:szCs w:val="30"/>
+        </w:rPr>
+        <w:t xml:space="preserve"> (</w:t>
+      </w:r>
+      <w:proofErr w:type="spellStart"/>
+      <w:r>
+        <w:rPr>
+          <w:rFonts w:asciiTheme="majorHAnsi" w:hAnsiTheme="majorHAnsi" w:cstheme="majorHAnsi"/>
+          <w:b/>
+          <w:bCs/>
+          <w:sz w:val="30"/>
+          <w:szCs w:val="30"/>
+        </w:rPr>
+        <w:t>Intenções</w:t>
+      </w:r>
+      <w:proofErr w:type="spellEnd"/>
+      <w:r>
+        <w:rPr>
+          <w:rFonts w:asciiTheme="majorHAnsi" w:hAnsiTheme="majorHAnsi" w:cstheme="majorHAnsi"/>
+          <w:b/>
+          <w:bCs/>
+          <w:sz w:val="30"/>
+          <w:szCs w:val="30"/>
+        </w:rPr>
+        <w:t>)</w:t>
+      </w:r>
+    </w:p>
+    <w:p/>
+    <w:tbl>
+      <w:tblPr>
+        <w:tblStyle w:val="Tabelacomgrade"/>
+        <w:tblW w:w="0" w:type="auto"/>
+        <w:tblLook w:val="04A0" w:firstRow="1" w:lastRow="0" w:firstColumn="1" w:lastColumn="0" w:noHBand="0" w:noVBand="1"/>
+      </w:tblPr>
+      <w:tblGrid>
+        <w:gridCol w:w="2026"/>
+        <w:gridCol w:w="2026"/>
+        <w:gridCol w:w="2027"/>
+        <w:gridCol w:w="2027"/>
+        <w:gridCol w:w="2061"/>
+      </w:tblGrid>
+      <w:tr>
+        <w:trPr>
+          <w:tblHeader/>
+        </w:trPr>
+        <w:tc>
+          <w:tcPr>
+            <w:tcW w:w="2026" w:type="dxa"/>
+            <w:shd w:val="clear" w:color="auto" w:fill="7A1F24"/>
+          </w:tcPr>
+          <w:p>
+            <w:pPr>
+              <w:spacing w:before="20" w:after="20"/>
+              <w:jc w:val="center"/>
+              <w:rPr>
+                <w:b/>
+                <w:color w:val="FFFFFF"/>
+                <w:sz w:val="16"/>
+              </w:rPr>
+            </w:pPr>
+            <w:proofErr w:type="spellStart"/>
+            <w:r>
+              <w:rPr>
+                <w:b/>
+                <w:color w:val="FFFFFF"/>
+                <w:sz w:val="16"/>
+              </w:rPr>
+              <w:t>Pergunta</w:t>
+            </w:r>
+            <w:proofErr w:type="spellEnd"/>
+            <w:r>
+              <w:rPr>
+                <w:b/>
+                <w:color w:val="FFFFFF"/>
+                <w:sz w:val="16"/>
+              </w:rPr>
+              <w:t xml:space="preserve"> de </w:t>
+            </w:r>
+            <w:proofErr w:type="spellStart"/>
+            <w:r>
+              <w:rPr>
+                <w:b/>
+                <w:color w:val="FFFFFF"/>
+                <w:sz w:val="16"/>
+              </w:rPr>
+              <w:t>Exemplo</w:t>
+            </w:r>
+            <w:proofErr w:type="spellEnd"/>
+          </w:p>
+        </w:tc>
+        <w:tc>
+          <w:tcPr>
+            <w:tcW w:w="2026" w:type="dxa"/>
+            <w:shd w:val="clear" w:color="auto" w:fill="7A1F24"/>
+          </w:tcPr>
+          <w:p>
+            <w:pPr>
+              <w:spacing w:before="20" w:after="20"/>
+              <w:rPr>
+                <w:b/>
+                <w:color w:val="FFFFFF"/>
+                <w:sz w:val="16"/>
+              </w:rPr>
+            </w:pPr>
+            <w:proofErr w:type="spellStart"/>
+            <w:r>
+              <w:rPr>
+                <w:b/>
+                <w:color w:val="FFFFFF"/>
+                <w:sz w:val="16"/>
+              </w:rPr>
+              <w:t>Intenção</w:t>
+            </w:r>
+            <w:proofErr w:type="spellEnd"/>
+          </w:p>
+        </w:tc>
+        <w:tc>
+          <w:tcPr>
+            <w:tcW w:w="2027" w:type="dxa"/>
+            <w:shd w:val="clear" w:color="auto" w:fill="7A1F24"/>
+          </w:tcPr>
+          <w:p>
+            <w:pPr>
+              <w:spacing w:before="20" w:after="20"/>
+              <w:rPr>
+                <w:b/>
+                <w:color w:val="FFFFFF"/>
+                <w:sz w:val="16"/>
+              </w:rPr>
+            </w:pPr>
+            <w:proofErr w:type="spellStart"/>
+            <w:r>
+              <w:rPr>
+                <w:b/>
+                <w:color w:val="FFFFFF"/>
+                <w:sz w:val="16"/>
+              </w:rPr>
+              <w:t>Entidade</w:t>
+            </w:r>
+            <w:proofErr w:type="spellEnd"/>
+          </w:p>
+        </w:tc>
+        <w:tc>
+          <w:tcPr>
+            <w:tcW w:w="2027" w:type="dxa"/>
+            <w:shd w:val="clear" w:color="auto" w:fill="7A1F24"/>
+          </w:tcPr>
+          <w:p>
+            <w:pPr>
+              <w:spacing w:before="20" w:after="20"/>
+              <w:rPr>
+                <w:b/>
+                <w:color w:val="FFFFFF"/>
+                <w:sz w:val="16"/>
+              </w:rPr>
+            </w:pPr>
+            <w:proofErr w:type="spellStart"/>
+            <w:r>
+              <w:rPr>
+                <w:b/>
+                <w:color w:val="FFFFFF"/>
+                <w:sz w:val="16"/>
+              </w:rPr>
+              <w:t>Ação</w:t>
+            </w:r>
+            <w:proofErr w:type="spellEnd"/>
+          </w:p>
+        </w:tc>
+        <w:tc>
+          <w:tcPr>
+            <w:tcW w:w="2061" w:type="dxa"/>
+            <w:shd w:val="clear" w:color="auto" w:fill="7A1F24"/>
+            <w:vAlign w:val="center"/>
+          </w:tcPr>
+          <w:p>
+            <w:pPr>
+              <w:spacing w:before="20" w:after="20"/>
+              <w:rPr>
+                <w:color w:val="FFFFFF" w:themeColor="background1"/>
+              </w:rPr>
+            </w:pPr>
+            <w:r>
+              <w:rPr>
+                <w:b/>
+                <w:bCs/>
+                <w:color w:val="FFFFFF" w:themeColor="background1"/>
+                <w:sz w:val="16"/>
+                <w:szCs w:val="16"/>
+              </w:rPr>
+              <w:t>Fallback</w:t>
+            </w:r>
+          </w:p>
+        </w:tc>
+      </w:tr>
+      <w:tr>
+        <w:tc>
+          <w:tcPr>
+            <w:tcW w:w="2026" w:type="dxa"/>
+          </w:tcPr>
+          <w:p>
+            <w:pPr>
+              <w:spacing w:before="20" w:after="20"/>
+              <w:rPr>
+                <w:sz w:val="16"/>
+              </w:rPr>
+            </w:pPr>
+            <w:r>
+              <w:rPr>
+                <w:sz w:val="16"/>
+              </w:rPr>
+              <w:t xml:space="preserve">"Procure Dom </w:t>
+            </w:r>
+            <w:proofErr w:type="spellStart"/>
+            <w:r>
+              <w:rPr>
+                <w:sz w:val="16"/>
+              </w:rPr>
+              <w:t>Casmurro</w:t>
+            </w:r>
+            <w:proofErr w:type="spellEnd"/>
+            <w:r>
+              <w:rPr>
+                <w:sz w:val="16"/>
+              </w:rPr>
+              <w:t>"</w:t>
+            </w:r>
+          </w:p>
+        </w:tc>
+        <w:tc>
+          <w:tcPr>
+            <w:tcW w:w="2026" w:type="dxa"/>
+          </w:tcPr>
+          <w:p>
+            <w:pPr>
+              <w:spacing w:before="20" w:after="20"/>
+              <w:rPr>
+                <w:sz w:val="16"/>
+              </w:rPr>
+            </w:pPr>
+            <w:proofErr w:type="spellStart"/>
+            <w:r>
+              <w:rPr>
+                <w:sz w:val="16"/>
+              </w:rPr>
+              <w:t>buscar_por_titulo</w:t>
+            </w:r>
+            <w:proofErr w:type="spellEnd"/>
+          </w:p>
+        </w:tc>
+        <w:tc>
+          <w:tcPr>
+            <w:tcW w:w="2027" w:type="dxa"/>
+          </w:tcPr>
+          <w:p>
+            <w:pPr>
+              <w:spacing w:before="20" w:after="20"/>
+              <w:rPr>
+                <w:sz w:val="16"/>
+              </w:rPr>
+            </w:pPr>
+            <w:proofErr w:type="spellStart"/>
+            <w:r>
+              <w:rPr>
+                <w:sz w:val="16"/>
+              </w:rPr>
+              <w:t>Título</w:t>
+            </w:r>
+            <w:proofErr w:type="spellEnd"/>
+          </w:p>
+        </w:tc>
+        <w:tc>
+          <w:tcPr>
+            <w:tcW w:w="2027" w:type="dxa"/>
+          </w:tcPr>
+          <w:p>
+            <w:pPr>
+              <w:spacing w:before="20" w:after="20"/>
+              <w:rPr>
+                <w:sz w:val="16"/>
+              </w:rPr>
+            </w:pPr>
+            <w:r>
+              <w:rPr>
+                <w:sz w:val="16"/>
+              </w:rPr>
+              <w:t xml:space="preserve">Consulta o </w:t>
+            </w:r>
+            <w:proofErr w:type="spellStart"/>
+            <w:r>
+              <w:rPr>
+                <w:sz w:val="16"/>
+              </w:rPr>
+              <w:t>título</w:t>
+            </w:r>
+            <w:proofErr w:type="spellEnd"/>
+            <w:r>
+              <w:rPr>
+                <w:sz w:val="16"/>
+              </w:rPr>
+              <w:t xml:space="preserve"> </w:t>
+            </w:r>
+            <w:proofErr w:type="spellStart"/>
+            <w:r>
+              <w:rPr>
+                <w:sz w:val="16"/>
+              </w:rPr>
+              <w:t>na</w:t>
+            </w:r>
+            <w:proofErr w:type="spellEnd"/>
+            <w:r>
+              <w:rPr>
+                <w:sz w:val="16"/>
+              </w:rPr>
+              <w:t xml:space="preserve"> </w:t>
+            </w:r>
+            <w:proofErr w:type="spellStart"/>
+            <w:r>
+              <w:rPr>
+                <w:sz w:val="16"/>
+              </w:rPr>
+              <w:t>fonte</w:t>
+            </w:r>
+            <w:proofErr w:type="spellEnd"/>
+            <w:r>
+              <w:rPr>
+                <w:sz w:val="16"/>
+              </w:rPr>
+              <w:t xml:space="preserve"> e </w:t>
+            </w:r>
+            <w:proofErr w:type="spellStart"/>
+            <w:r>
+              <w:rPr>
+                <w:sz w:val="16"/>
+              </w:rPr>
+              <w:t>lista</w:t>
+            </w:r>
+            <w:proofErr w:type="spellEnd"/>
+            <w:r>
+              <w:rPr>
+                <w:sz w:val="16"/>
+              </w:rPr>
+              <w:t xml:space="preserve"> </w:t>
+            </w:r>
+            <w:proofErr w:type="spellStart"/>
+            <w:r>
+              <w:rPr>
+                <w:sz w:val="16"/>
+              </w:rPr>
+              <w:t>candidatos</w:t>
+            </w:r>
+            <w:proofErr w:type="spellEnd"/>
+            <w:r>
+              <w:rPr>
+                <w:sz w:val="16"/>
+              </w:rPr>
+              <w:t>.</w:t>
+            </w:r>
+          </w:p>
+        </w:tc>
+        <w:tc>
+          <w:tcPr>
+            <w:tcW w:w="2061" w:type="dxa"/>
+            <w:vAlign w:val="center"/>
+          </w:tcPr>
+          <w:p>
+            <w:pPr>
+              <w:spacing w:before="20" w:after="20"/>
+            </w:pPr>
+            <w:r>
+              <w:t xml:space="preserve">Pede o </w:t>
+            </w:r>
+            <w:proofErr w:type="spellStart"/>
+            <w:r>
+              <w:t>título</w:t>
+            </w:r>
+            <w:proofErr w:type="spellEnd"/>
+            <w:r>
+              <w:t xml:space="preserve"> se </w:t>
+            </w:r>
+            <w:proofErr w:type="spellStart"/>
+            <w:r>
+              <w:t>ausente</w:t>
+            </w:r>
+            <w:proofErr w:type="spellEnd"/>
+            <w:r>
+              <w:t xml:space="preserve">, </w:t>
+            </w:r>
+            <w:proofErr w:type="spellStart"/>
+            <w:r>
+              <w:t>ou</w:t>
+            </w:r>
+            <w:proofErr w:type="spellEnd"/>
+            <w:r>
+              <w:t xml:space="preserve"> </w:t>
+            </w:r>
+            <w:proofErr w:type="spellStart"/>
+            <w:r>
+              <w:t>informa</w:t>
+            </w:r>
+            <w:proofErr w:type="spellEnd"/>
+            <w:r>
+              <w:t xml:space="preserve"> </w:t>
+            </w:r>
+            <w:proofErr w:type="spellStart"/>
+            <w:r>
+              <w:t>ausência</w:t>
+            </w:r>
+            <w:proofErr w:type="spellEnd"/>
+            <w:r>
+              <w:t xml:space="preserve"> </w:t>
+            </w:r>
+            <w:proofErr w:type="spellStart"/>
+            <w:r>
+              <w:t>na</w:t>
+            </w:r>
+            <w:proofErr w:type="spellEnd"/>
+            <w:r>
+              <w:t xml:space="preserve"> </w:t>
+            </w:r>
+            <w:proofErr w:type="spellStart"/>
+            <w:r>
+              <w:t>fonte</w:t>
+            </w:r>
+            <w:proofErr w:type="spellEnd"/>
+            <w:r>
+              <w:t>.</w:t>
+            </w:r>
+          </w:p>
+        </w:tc>
+      </w:tr>
+      <w:tr>
+        <w:tc>
+          <w:tcPr>
+            <w:tcW w:w="2026" w:type="dxa"/>
+            <w:shd w:val="clear" w:color="auto" w:fill="F5F1EE"/>
+          </w:tcPr>
+          <w:p>
+            <w:pPr>
+              <w:spacing w:before="20" w:after="20"/>
+              <w:rPr>
+                <w:sz w:val="16"/>
+              </w:rPr>
+            </w:pPr>
+            <w:r>
+              <w:rPr>
+                <w:sz w:val="16"/>
+              </w:rPr>
+              <w:t xml:space="preserve">"Quais </w:t>
+            </w:r>
+            <w:proofErr w:type="spellStart"/>
+            <w:r>
+              <w:rPr>
+                <w:sz w:val="16"/>
+              </w:rPr>
+              <w:t>livros</w:t>
+            </w:r>
+            <w:proofErr w:type="spellEnd"/>
+            <w:r>
+              <w:rPr>
+                <w:sz w:val="16"/>
+              </w:rPr>
+              <w:t xml:space="preserve"> de Machado?"</w:t>
+            </w:r>
+          </w:p>
+        </w:tc>
+        <w:tc>
+          <w:tcPr>
+            <w:tcW w:w="2026" w:type="dxa"/>
+            <w:shd w:val="clear" w:color="auto" w:fill="F5F1EE"/>
+          </w:tcPr>
+          <w:p>
+            <w:pPr>
+              <w:spacing w:before="20" w:after="20"/>
+              <w:rPr>
+                <w:sz w:val="16"/>
+              </w:rPr>
+            </w:pPr>
+            <w:proofErr w:type="spellStart"/>
+            <w:r>
+              <w:rPr>
+                <w:sz w:val="16"/>
+              </w:rPr>
+              <w:t>buscar_obras_autor</w:t>
+            </w:r>
+            <w:proofErr w:type="spellEnd"/>
+          </w:p>
+        </w:tc>
+        <w:tc>
+          <w:tcPr>
+            <w:tcW w:w="2027" w:type="dxa"/>
+            <w:shd w:val="clear" w:color="auto" w:fill="F5F1EE"/>
+          </w:tcPr>
+          <w:p>
+            <w:pPr>
+              <w:spacing w:before="20" w:after="20"/>
+              <w:rPr>
+                <w:sz w:val="16"/>
+              </w:rPr>
+            </w:pPr>
+            <w:r>
+              <w:rPr>
+                <w:sz w:val="16"/>
+              </w:rPr>
+              <w:t>Autor</w:t>
+            </w:r>
+          </w:p>
+        </w:tc>
+        <w:tc>
+          <w:tcPr>
+            <w:tcW w:w="2027" w:type="dxa"/>
+            <w:shd w:val="clear" w:color="auto" w:fill="F5F1EE"/>
+          </w:tcPr>
+          <w:p>
+            <w:pPr>
+              <w:spacing w:before="20" w:after="20"/>
+              <w:rPr>
+                <w:sz w:val="16"/>
+              </w:rPr>
+            </w:pPr>
+            <w:r>
+              <w:rPr>
+                <w:sz w:val="16"/>
+              </w:rPr>
+              <w:t xml:space="preserve">Consulta </w:t>
+            </w:r>
+            <w:proofErr w:type="spellStart"/>
+            <w:r>
+              <w:rPr>
+                <w:sz w:val="16"/>
+              </w:rPr>
+              <w:t>obras</w:t>
+            </w:r>
+            <w:proofErr w:type="spellEnd"/>
+            <w:r>
+              <w:rPr>
+                <w:sz w:val="16"/>
+              </w:rPr>
+              <w:t xml:space="preserve"> </w:t>
+            </w:r>
+            <w:proofErr w:type="spellStart"/>
+            <w:r>
+              <w:rPr>
+                <w:sz w:val="16"/>
+              </w:rPr>
+              <w:t>por</w:t>
+            </w:r>
+            <w:proofErr w:type="spellEnd"/>
+            <w:r>
+              <w:rPr>
+                <w:sz w:val="16"/>
+              </w:rPr>
+              <w:t xml:space="preserve"> </w:t>
+            </w:r>
+            <w:proofErr w:type="spellStart"/>
+            <w:r>
+              <w:rPr>
+                <w:sz w:val="16"/>
+              </w:rPr>
+              <w:t>autor</w:t>
+            </w:r>
+            <w:proofErr w:type="spellEnd"/>
+            <w:r>
+              <w:rPr>
+                <w:sz w:val="16"/>
+              </w:rPr>
+              <w:t xml:space="preserve"> </w:t>
+            </w:r>
+            <w:proofErr w:type="spellStart"/>
+            <w:r>
+              <w:rPr>
+                <w:sz w:val="16"/>
+              </w:rPr>
+              <w:t>na</w:t>
+            </w:r>
+            <w:proofErr w:type="spellEnd"/>
+            <w:r>
+              <w:rPr>
+                <w:sz w:val="16"/>
+              </w:rPr>
+              <w:t xml:space="preserve"> </w:t>
+            </w:r>
+            <w:proofErr w:type="spellStart"/>
+            <w:r>
+              <w:rPr>
+                <w:sz w:val="16"/>
+              </w:rPr>
+              <w:t>fonte</w:t>
+            </w:r>
+            <w:proofErr w:type="spellEnd"/>
+            <w:r>
+              <w:rPr>
+                <w:sz w:val="16"/>
+              </w:rPr>
+              <w:t>.</w:t>
+            </w:r>
+          </w:p>
+        </w:tc>
+        <w:tc>
+          <w:tcPr>
+            <w:tcW w:w="2061" w:type="dxa"/>
+            <w:shd w:val="clear" w:color="auto" w:fill="F5F1EE"/>
+            <w:vAlign w:val="center"/>
+          </w:tcPr>
+          <w:p>
+            <w:pPr>
+              <w:spacing w:before="20" w:after="20"/>
+            </w:pPr>
+            <w:r>
+              <w:t xml:space="preserve">Pede o </w:t>
+            </w:r>
+            <w:proofErr w:type="spellStart"/>
+            <w:r>
+              <w:t>nome</w:t>
+            </w:r>
+            <w:proofErr w:type="spellEnd"/>
+            <w:r>
+              <w:t xml:space="preserve"> </w:t>
+            </w:r>
+            <w:proofErr w:type="spellStart"/>
+            <w:r>
+              <w:t>completo</w:t>
+            </w:r>
+            <w:proofErr w:type="spellEnd"/>
+            <w:r>
+              <w:t xml:space="preserve"> se </w:t>
+            </w:r>
+            <w:proofErr w:type="spellStart"/>
+            <w:r>
+              <w:t>houver</w:t>
+            </w:r>
+            <w:proofErr w:type="spellEnd"/>
+            <w:r>
+              <w:t xml:space="preserve"> </w:t>
+            </w:r>
+            <w:proofErr w:type="spellStart"/>
+            <w:r>
+              <w:t>homónimos</w:t>
+            </w:r>
+            <w:proofErr w:type="spellEnd"/>
+            <w:r>
+              <w:t xml:space="preserve"> </w:t>
+            </w:r>
+            <w:proofErr w:type="spellStart"/>
+            <w:r>
+              <w:t>ou</w:t>
+            </w:r>
+            <w:proofErr w:type="spellEnd"/>
+            <w:r>
+              <w:t xml:space="preserve"> </w:t>
+            </w:r>
+            <w:proofErr w:type="spellStart"/>
+            <w:r>
+              <w:t>ambiguidade</w:t>
+            </w:r>
+            <w:proofErr w:type="spellEnd"/>
+            <w:r>
+              <w:t>.</w:t>
+            </w:r>
+          </w:p>
+        </w:tc>
+      </w:tr>
+      <w:tr>
+        <w:tc>
+          <w:tcPr>
+            <w:tcW w:w="2026" w:type="dxa"/>
+          </w:tcPr>
+          <w:p>
+            <w:pPr>
+              <w:spacing w:before="20" w:after="20"/>
+              <w:rPr>
+                <w:sz w:val="16"/>
+              </w:rPr>
+            </w:pPr>
+            <w:r>
+              <w:rPr>
+                <w:sz w:val="16"/>
+              </w:rPr>
+              <w:t>"</w:t>
+            </w:r>
+            <w:proofErr w:type="spellStart"/>
+            <w:r>
+              <w:rPr>
+                <w:sz w:val="16"/>
+              </w:rPr>
+              <w:t>Mostre</w:t>
+            </w:r>
+            <w:proofErr w:type="spellEnd"/>
+            <w:r>
+              <w:rPr>
+                <w:sz w:val="16"/>
+              </w:rPr>
+              <w:t xml:space="preserve"> </w:t>
+            </w:r>
+            <w:proofErr w:type="spellStart"/>
+            <w:r>
+              <w:rPr>
+                <w:sz w:val="16"/>
+              </w:rPr>
+              <w:t>ficção</w:t>
+            </w:r>
+            <w:proofErr w:type="spellEnd"/>
+            <w:r>
+              <w:rPr>
+                <w:sz w:val="16"/>
+              </w:rPr>
+              <w:t xml:space="preserve"> </w:t>
+            </w:r>
+            <w:proofErr w:type="spellStart"/>
+            <w:r>
+              <w:rPr>
+                <w:sz w:val="16"/>
+              </w:rPr>
+              <w:t>científica</w:t>
+            </w:r>
+            <w:proofErr w:type="spellEnd"/>
+            <w:r>
+              <w:rPr>
+                <w:sz w:val="16"/>
+              </w:rPr>
+              <w:t>"</w:t>
+            </w:r>
+          </w:p>
+        </w:tc>
+        <w:tc>
+          <w:tcPr>
+            <w:tcW w:w="2026" w:type="dxa"/>
+          </w:tcPr>
+          <w:p>
+            <w:pPr>
+              <w:spacing w:before="20" w:after="20"/>
+              <w:rPr>
+                <w:sz w:val="16"/>
+              </w:rPr>
+            </w:pPr>
+            <w:proofErr w:type="spellStart"/>
+            <w:r>
+              <w:rPr>
+                <w:sz w:val="16"/>
+              </w:rPr>
+              <w:t>buscar_por_assunto</w:t>
+            </w:r>
+            <w:proofErr w:type="spellEnd"/>
+          </w:p>
+        </w:tc>
+        <w:tc>
+          <w:tcPr>
+            <w:tcW w:w="2027" w:type="dxa"/>
+          </w:tcPr>
+          <w:p>
+            <w:pPr>
+              <w:spacing w:before="20" w:after="20"/>
+              <w:rPr>
+                <w:sz w:val="16"/>
+              </w:rPr>
+            </w:pPr>
+            <w:proofErr w:type="spellStart"/>
+            <w:r>
+              <w:rPr>
+                <w:sz w:val="16"/>
+              </w:rPr>
+              <w:t>ssunto</w:t>
+            </w:r>
+            <w:proofErr w:type="spellEnd"/>
+            <w:r>
+              <w:rPr>
+                <w:sz w:val="16"/>
+              </w:rPr>
+              <w:t>/</w:t>
+            </w:r>
+            <w:proofErr w:type="spellStart"/>
+            <w:r>
+              <w:rPr>
+                <w:sz w:val="16"/>
+              </w:rPr>
+              <w:t>Gênero</w:t>
+            </w:r>
+            <w:proofErr w:type="spellEnd"/>
+          </w:p>
+        </w:tc>
+        <w:tc>
+          <w:tcPr>
+            <w:tcW w:w="2027" w:type="dxa"/>
+          </w:tcPr>
+          <w:p>
+            <w:pPr>
+              <w:spacing w:before="20" w:after="20"/>
+              <w:rPr>
+                <w:sz w:val="16"/>
+              </w:rPr>
+            </w:pPr>
+            <w:r>
+              <w:rPr>
+                <w:sz w:val="16"/>
+              </w:rPr>
+              <w:t xml:space="preserve">Consulta o </w:t>
+            </w:r>
+            <w:proofErr w:type="spellStart"/>
+            <w:r>
+              <w:rPr>
+                <w:sz w:val="16"/>
+              </w:rPr>
+              <w:t>assunto</w:t>
+            </w:r>
+            <w:proofErr w:type="spellEnd"/>
+            <w:r>
+              <w:rPr>
+                <w:sz w:val="16"/>
+              </w:rPr>
+              <w:t xml:space="preserve"> e </w:t>
+            </w:r>
+            <w:proofErr w:type="spellStart"/>
+            <w:r>
+              <w:rPr>
+                <w:sz w:val="16"/>
+              </w:rPr>
+              <w:t>apresenta</w:t>
+            </w:r>
+            <w:proofErr w:type="spellEnd"/>
+            <w:r>
+              <w:rPr>
+                <w:sz w:val="16"/>
+              </w:rPr>
+              <w:t xml:space="preserve"> </w:t>
+            </w:r>
+            <w:proofErr w:type="spellStart"/>
+            <w:r>
+              <w:rPr>
+                <w:sz w:val="16"/>
+              </w:rPr>
+              <w:t>obras</w:t>
+            </w:r>
+            <w:proofErr w:type="spellEnd"/>
+            <w:r>
+              <w:rPr>
+                <w:sz w:val="16"/>
+              </w:rPr>
+              <w:t xml:space="preserve"> </w:t>
+            </w:r>
+            <w:proofErr w:type="spellStart"/>
+            <w:r>
+              <w:rPr>
+                <w:sz w:val="16"/>
+              </w:rPr>
+              <w:t>relacionadas</w:t>
+            </w:r>
+            <w:proofErr w:type="spellEnd"/>
+            <w:r>
+              <w:rPr>
+                <w:sz w:val="16"/>
+              </w:rPr>
+              <w:t>.</w:t>
+            </w:r>
+          </w:p>
+        </w:tc>
+        <w:tc>
+          <w:tcPr>
+            <w:tcW w:w="2061" w:type="dxa"/>
+            <w:vAlign w:val="center"/>
+          </w:tcPr>
+          <w:p>
+            <w:pPr>
+              <w:spacing w:before="20" w:after="20"/>
+            </w:pPr>
+            <w:r>
+              <w:t xml:space="preserve">Pede </w:t>
+            </w:r>
+            <w:proofErr w:type="spellStart"/>
+            <w:r>
+              <w:t>especificação</w:t>
+            </w:r>
+            <w:proofErr w:type="spellEnd"/>
+            <w:r>
+              <w:t xml:space="preserve"> </w:t>
+            </w:r>
+            <w:proofErr w:type="spellStart"/>
+            <w:r>
+              <w:t>caso</w:t>
+            </w:r>
+            <w:proofErr w:type="spellEnd"/>
+            <w:r>
+              <w:t xml:space="preserve"> o </w:t>
+            </w:r>
+            <w:proofErr w:type="spellStart"/>
+            <w:r>
+              <w:t>termo</w:t>
+            </w:r>
+            <w:proofErr w:type="spellEnd"/>
+            <w:r>
+              <w:t xml:space="preserve"> </w:t>
+            </w:r>
+            <w:proofErr w:type="spellStart"/>
+            <w:r>
+              <w:t>não</w:t>
+            </w:r>
+            <w:proofErr w:type="spellEnd"/>
+            <w:r>
+              <w:t xml:space="preserve"> </w:t>
+            </w:r>
+            <w:proofErr w:type="spellStart"/>
+            <w:r>
+              <w:t>seja</w:t>
+            </w:r>
+            <w:proofErr w:type="spellEnd"/>
+            <w:r>
+              <w:t xml:space="preserve"> </w:t>
+            </w:r>
+            <w:proofErr w:type="spellStart"/>
+            <w:r>
+              <w:t>encontrado</w:t>
+            </w:r>
+            <w:proofErr w:type="spellEnd"/>
+            <w:r>
+              <w:t>.</w:t>
+            </w:r>
+          </w:p>
+        </w:tc>
+      </w:tr>
+      <w:tr>
+        <w:tc>
+          <w:tcPr>
+            <w:tcW w:w="2026" w:type="dxa"/>
+            <w:shd w:val="clear" w:color="auto" w:fill="F5F1EE"/>
+          </w:tcPr>
+          <w:p>
+            <w:pPr>
+              <w:spacing w:before="20" w:after="20"/>
+              <w:rPr>
+                <w:sz w:val="16"/>
+              </w:rPr>
+            </w:pPr>
+            <w:r>
+              <w:rPr>
+                <w:sz w:val="16"/>
+              </w:rPr>
+              <w:t xml:space="preserve">"Quem </w:t>
+            </w:r>
+            <w:proofErr w:type="spellStart"/>
+            <w:r>
+              <w:rPr>
+                <w:sz w:val="16"/>
+              </w:rPr>
+              <w:t>escreveu</w:t>
+            </w:r>
+            <w:proofErr w:type="spellEnd"/>
+            <w:r>
+              <w:rPr>
+                <w:sz w:val="16"/>
+              </w:rPr>
+              <w:t xml:space="preserve"> o </w:t>
+            </w:r>
+            <w:proofErr w:type="spellStart"/>
+            <w:r>
+              <w:rPr>
+                <w:sz w:val="16"/>
+              </w:rPr>
+              <w:t>segundo</w:t>
+            </w:r>
+            <w:proofErr w:type="spellEnd"/>
+            <w:r>
+              <w:rPr>
+                <w:sz w:val="16"/>
+              </w:rPr>
+              <w:t>?"</w:t>
+            </w:r>
+          </w:p>
+        </w:tc>
+        <w:tc>
+          <w:tcPr>
+            <w:tcW w:w="2026" w:type="dxa"/>
+            <w:shd w:val="clear" w:color="auto" w:fill="F5F1EE"/>
+          </w:tcPr>
+          <w:p>
+            <w:pPr>
+              <w:spacing w:before="20" w:after="20"/>
+              <w:rPr>
+                <w:sz w:val="16"/>
+              </w:rPr>
+            </w:pPr>
+            <w:proofErr w:type="spellStart"/>
+            <w:r>
+              <w:rPr>
+                <w:sz w:val="16"/>
+              </w:rPr>
+              <w:t>consultar_detalhes</w:t>
+            </w:r>
+            <w:proofErr w:type="spellEnd"/>
+          </w:p>
+        </w:tc>
+        <w:tc>
+          <w:tcPr>
+            <w:tcW w:w="2027" w:type="dxa"/>
+            <w:shd w:val="clear" w:color="auto" w:fill="F5F1EE"/>
+          </w:tcPr>
+          <w:p>
+            <w:pPr>
+              <w:spacing w:before="20" w:after="20"/>
+              <w:rPr>
+                <w:sz w:val="16"/>
+              </w:rPr>
+            </w:pPr>
+            <w:r>
+              <w:rPr>
+                <w:sz w:val="16"/>
+              </w:rPr>
+              <w:t>Obra (</w:t>
+            </w:r>
+            <w:proofErr w:type="spellStart"/>
+            <w:r>
+              <w:rPr>
+                <w:sz w:val="16"/>
+              </w:rPr>
+              <w:t>Contexto</w:t>
+            </w:r>
+            <w:proofErr w:type="spellEnd"/>
+            <w:r>
+              <w:rPr>
+                <w:sz w:val="16"/>
+              </w:rPr>
+              <w:t xml:space="preserve">/ID) e Campo </w:t>
+            </w:r>
+            <w:proofErr w:type="spellStart"/>
+            <w:r>
+              <w:rPr>
+                <w:sz w:val="16"/>
+              </w:rPr>
+              <w:t>solicitado</w:t>
+            </w:r>
+            <w:proofErr w:type="spellEnd"/>
+          </w:p>
+        </w:tc>
+        <w:tc>
+          <w:tcPr>
+            <w:tcW w:w="2027" w:type="dxa"/>
+            <w:shd w:val="clear" w:color="auto" w:fill="F5F1EE"/>
+          </w:tcPr>
+          <w:p>
+            <w:pPr>
+              <w:spacing w:before="20" w:after="20"/>
+              <w:rPr>
+                <w:sz w:val="16"/>
+              </w:rPr>
+            </w:pPr>
+            <w:r>
+              <w:rPr>
+                <w:sz w:val="16"/>
+              </w:rPr>
+              <w:t xml:space="preserve">Resolve </w:t>
+            </w:r>
+            <w:proofErr w:type="gramStart"/>
+            <w:r>
+              <w:rPr>
+                <w:sz w:val="16"/>
+              </w:rPr>
+              <w:t>a</w:t>
+            </w:r>
+            <w:proofErr w:type="gramEnd"/>
+            <w:r>
+              <w:rPr>
+                <w:sz w:val="16"/>
+              </w:rPr>
+              <w:t xml:space="preserve"> </w:t>
+            </w:r>
+            <w:proofErr w:type="spellStart"/>
+            <w:r>
+              <w:rPr>
+                <w:sz w:val="16"/>
+              </w:rPr>
+              <w:t>obra</w:t>
+            </w:r>
+            <w:proofErr w:type="spellEnd"/>
+            <w:r>
+              <w:rPr>
+                <w:sz w:val="16"/>
+              </w:rPr>
+              <w:t xml:space="preserve"> </w:t>
+            </w:r>
+            <w:proofErr w:type="spellStart"/>
+            <w:r>
+              <w:rPr>
+                <w:sz w:val="16"/>
+              </w:rPr>
+              <w:t>na</w:t>
+            </w:r>
+            <w:proofErr w:type="spellEnd"/>
+            <w:r>
+              <w:rPr>
+                <w:sz w:val="16"/>
+              </w:rPr>
+              <w:t xml:space="preserve"> </w:t>
+            </w:r>
+            <w:proofErr w:type="spellStart"/>
+            <w:r>
+              <w:rPr>
+                <w:sz w:val="16"/>
+              </w:rPr>
+              <w:t>sessão</w:t>
+            </w:r>
+            <w:proofErr w:type="spellEnd"/>
+            <w:r>
+              <w:rPr>
+                <w:sz w:val="16"/>
+              </w:rPr>
+              <w:t xml:space="preserve"> e </w:t>
+            </w:r>
+            <w:proofErr w:type="spellStart"/>
+            <w:r>
+              <w:rPr>
+                <w:sz w:val="16"/>
+              </w:rPr>
+              <w:t>mostra</w:t>
+            </w:r>
+            <w:proofErr w:type="spellEnd"/>
+            <w:r>
+              <w:rPr>
+                <w:sz w:val="16"/>
+              </w:rPr>
+              <w:t xml:space="preserve"> </w:t>
+            </w:r>
+            <w:proofErr w:type="spellStart"/>
+            <w:r>
+              <w:rPr>
+                <w:sz w:val="16"/>
+              </w:rPr>
+              <w:t>os</w:t>
+            </w:r>
+            <w:proofErr w:type="spellEnd"/>
+            <w:r>
+              <w:rPr>
+                <w:sz w:val="16"/>
+              </w:rPr>
+              <w:t xml:space="preserve"> campos </w:t>
+            </w:r>
+            <w:proofErr w:type="spellStart"/>
+            <w:r>
+              <w:rPr>
+                <w:sz w:val="16"/>
+              </w:rPr>
+              <w:t>disponíveis</w:t>
+            </w:r>
+            <w:proofErr w:type="spellEnd"/>
+            <w:r>
+              <w:rPr>
+                <w:sz w:val="16"/>
+              </w:rPr>
+              <w:t>.</w:t>
+            </w:r>
+          </w:p>
+        </w:tc>
+        <w:tc>
+          <w:tcPr>
+            <w:tcW w:w="2061" w:type="dxa"/>
+            <w:shd w:val="clear" w:color="auto" w:fill="F5F1EE"/>
+            <w:vAlign w:val="center"/>
+          </w:tcPr>
+          <w:p>
+            <w:pPr>
+              <w:spacing w:before="20" w:after="20"/>
+            </w:pPr>
+            <w:r>
+              <w:t xml:space="preserve">Pede para </w:t>
+            </w:r>
+            <w:proofErr w:type="spellStart"/>
+            <w:r>
+              <w:t>identificar</w:t>
+            </w:r>
+            <w:proofErr w:type="spellEnd"/>
+            <w:r>
+              <w:t xml:space="preserve"> </w:t>
+            </w:r>
+            <w:proofErr w:type="gramStart"/>
+            <w:r>
+              <w:t>a</w:t>
+            </w:r>
+            <w:proofErr w:type="gramEnd"/>
+            <w:r>
+              <w:t xml:space="preserve"> </w:t>
+            </w:r>
+            <w:proofErr w:type="spellStart"/>
+            <w:r>
+              <w:t>obra</w:t>
+            </w:r>
+            <w:proofErr w:type="spellEnd"/>
+            <w:r>
+              <w:t xml:space="preserve"> se o </w:t>
+            </w:r>
+            <w:proofErr w:type="spellStart"/>
+            <w:r>
+              <w:t>contexto</w:t>
+            </w:r>
+            <w:proofErr w:type="spellEnd"/>
+            <w:r>
+              <w:t xml:space="preserve"> </w:t>
+            </w:r>
+            <w:proofErr w:type="spellStart"/>
+            <w:r>
+              <w:t>estiver</w:t>
+            </w:r>
+            <w:proofErr w:type="spellEnd"/>
+            <w:r>
+              <w:t xml:space="preserve"> </w:t>
+            </w:r>
+            <w:proofErr w:type="spellStart"/>
+            <w:r>
+              <w:t>vazio</w:t>
+            </w:r>
+            <w:proofErr w:type="spellEnd"/>
+            <w:r>
+              <w:t>.</w:t>
+            </w:r>
+          </w:p>
+        </w:tc>
+      </w:tr>
+    </w:tbl>
+    <w:p/>
     <w:p>
       <w:pPr>
         <w:pStyle w:val="Ttulo1"/>
       </w:pPr>
       <w:r>
-        <w:t>16. Referências e relação com documentos existentes</w:t>
+        <w:t>1</w:t>
+      </w:r>
+      <w:r>
+        <w:t>8</w:t>
+      </w:r>
+      <w:r>
+        <w:t>. Referências e relação com documentos existentes</w:t>
       </w:r>
     </w:p>
     <w:p>
@@ -17471,7 +18864,6 @@
         <w:pStyle w:val="Ttulo2"/>
       </w:pPr>
       <w:r>
-        <w:lastRenderedPageBreak/>
         <w:t>Aula complementar</w:t>
       </w:r>
     </w:p>
@@ -17587,6 +18979,7 @@
         <w:pStyle w:val="Ttulo2"/>
       </w:pPr>
       <w:r>
+        <w:lastRenderedPageBreak/>
         <w:t>Open Library Search API</w:t>
       </w:r>
     </w:p>
@@ -17685,7 +19078,15 @@
         <w:t>Proveniência:</w:t>
       </w:r>
       <w:r>
-        <w:t xml:space="preserve"> os planos e cenários estão alinhados ao escopo declarado e à aprovação relatada pelo grupo. O código e os testes ainda devem ser desenvolvidos e executados. Documentação online pode mudar; reconferir durante a implementação. Esta documentação foi redigida com apoio de IA generativa e precisa de revisão pela equipe antes de ser entregue </w:t>
+        <w:t xml:space="preserve"> os planos e cenários estão alinhados ao escopo declarado e à aprovação relatada pelo grupo. O código e os testes ainda devem ser desenvolvidos e executados. Documentação online pode mudar; reconferir durante a implementação. Esta documentação foi redigida com apoio de IA generativa e precisa de revisão pela equipe antes de ser </w:t>
+      </w:r>
+      <w:proofErr w:type="spellStart"/>
+      <w:r>
+        <w:t>entregue</w:t>
+      </w:r>
+      <w:proofErr w:type="spellEnd"/>
+      <w:r>
+        <w:t xml:space="preserve"> </w:t>
       </w:r>
       <w:proofErr w:type="spellStart"/>
       <w:r>
@@ -17712,524 +19113,14 @@
         <w:t>.</w:t>
       </w:r>
     </w:p>
-    <w:p/>
-    <w:p>
-      <w:pPr>
-        <w:rPr>
-          <w:lang w:val="pt-BR"/>
-        </w:rPr>
-      </w:pPr>
-      <w:r>
-        <w:rPr>
-          <w:b/>
-          <w:bCs/>
-          <w:lang w:val="pt-BR"/>
-        </w:rPr>
-        <w:t>Limites do Sistema (Fora do Escopo)</w:t>
-      </w:r>
-    </w:p>
-    <w:p>
-      <w:pPr>
-        <w:numPr>
-          <w:ilvl w:val="0"/>
-          <w:numId w:val="10"/>
-        </w:numPr>
-        <w:rPr>
-          <w:lang w:val="pt-BR"/>
-        </w:rPr>
-      </w:pPr>
-      <w:r>
-        <w:rPr>
-          <w:lang w:val="pt-BR"/>
-        </w:rPr>
-        <w:t>Não realiza recomendações personalizadas por perfil do aluno.</w:t>
-      </w:r>
-    </w:p>
-    <w:p>
-      <w:pPr>
-        <w:numPr>
-          <w:ilvl w:val="0"/>
-          <w:numId w:val="10"/>
-        </w:numPr>
-        <w:rPr>
-          <w:lang w:val="pt-BR"/>
-        </w:rPr>
-      </w:pPr>
-      <w:r>
-        <w:rPr>
-          <w:lang w:val="pt-BR"/>
-        </w:rPr>
-        <w:t>Não verifica disponibilidade de exemplares físicos, empréstimos, multas ou reservas.</w:t>
-      </w:r>
-    </w:p>
-    <w:p>
-      <w:pPr>
-        <w:numPr>
-          <w:ilvl w:val="0"/>
-          <w:numId w:val="10"/>
-        </w:numPr>
-        <w:rPr>
-          <w:lang w:val="pt-BR"/>
-        </w:rPr>
-      </w:pPr>
-      <w:r>
-        <w:rPr>
-          <w:lang w:val="pt-BR"/>
-        </w:rPr>
-        <w:t>Consultas bibliográficas somente leitura, sem ações externas.</w:t>
-      </w:r>
-    </w:p>
     <w:p>
       <w:pPr>
         <w:rPr>
           <w:u w:val="single"/>
-          <w:lang w:val="pt-BR"/>
         </w:rPr>
       </w:pPr>
-      <w:r>
-        <w:rPr>
-          <w:b/>
-          <w:bCs/>
-          <w:lang w:val="pt-BR"/>
-        </w:rPr>
-        <w:t>Fluxos de Interação (Intenções)</w:t>
-      </w:r>
     </w:p>
-    <w:p>
-      <w:pPr>
-        <w:numPr>
-          <w:ilvl w:val="0"/>
-          <w:numId w:val="11"/>
-        </w:numPr>
-        <w:rPr>
-          <w:lang w:val="pt-BR"/>
-        </w:rPr>
-      </w:pPr>
-      <w:proofErr w:type="spellStart"/>
-      <w:r>
-        <w:rPr>
-          <w:b/>
-          <w:bCs/>
-          <w:lang w:val="pt-BR"/>
-        </w:rPr>
-        <w:t>buscar_por_</w:t>
-      </w:r>
-      <w:proofErr w:type="gramStart"/>
-      <w:r>
-        <w:rPr>
-          <w:b/>
-          <w:bCs/>
-          <w:lang w:val="pt-BR"/>
-        </w:rPr>
-        <w:t>titulo</w:t>
-      </w:r>
-      <w:proofErr w:type="spellEnd"/>
-      <w:proofErr w:type="gramEnd"/>
-    </w:p>
-    <w:p>
-      <w:pPr>
-        <w:numPr>
-          <w:ilvl w:val="1"/>
-          <w:numId w:val="11"/>
-        </w:numPr>
-        <w:rPr>
-          <w:lang w:val="pt-BR"/>
-        </w:rPr>
-      </w:pPr>
-      <w:r>
-        <w:rPr>
-          <w:b/>
-          <w:bCs/>
-          <w:lang w:val="pt-BR"/>
-        </w:rPr>
-        <w:t>Objetivo:</w:t>
-      </w:r>
-      <w:r>
-        <w:rPr>
-          <w:lang w:val="pt-BR"/>
-        </w:rPr>
-        <w:t xml:space="preserve"> Localizar obras pelo título.</w:t>
-      </w:r>
-    </w:p>
-    <w:p>
-      <w:pPr>
-        <w:numPr>
-          <w:ilvl w:val="1"/>
-          <w:numId w:val="11"/>
-        </w:numPr>
-        <w:rPr>
-          <w:lang w:val="pt-BR"/>
-        </w:rPr>
-      </w:pPr>
-      <w:r>
-        <w:rPr>
-          <w:b/>
-          <w:bCs/>
-          <w:lang w:val="pt-BR"/>
-        </w:rPr>
-        <w:t>Ação:</w:t>
-      </w:r>
-      <w:r>
-        <w:rPr>
-          <w:lang w:val="pt-BR"/>
-        </w:rPr>
-        <w:t xml:space="preserve"> Consulta o título na Open Library e lista candidatos.</w:t>
-      </w:r>
-    </w:p>
-    <w:p>
-      <w:pPr>
-        <w:numPr>
-          <w:ilvl w:val="1"/>
-          <w:numId w:val="11"/>
-        </w:numPr>
-        <w:rPr>
-          <w:lang w:val="pt-BR"/>
-        </w:rPr>
-      </w:pPr>
-      <w:proofErr w:type="spellStart"/>
-      <w:r>
-        <w:rPr>
-          <w:b/>
-          <w:bCs/>
-          <w:lang w:val="pt-BR"/>
-        </w:rPr>
-        <w:lastRenderedPageBreak/>
-        <w:t>Fallback</w:t>
-      </w:r>
-      <w:proofErr w:type="spellEnd"/>
-      <w:r>
-        <w:rPr>
-          <w:b/>
-          <w:bCs/>
-          <w:lang w:val="pt-BR"/>
-        </w:rPr>
-        <w:t>:</w:t>
-      </w:r>
-      <w:r>
-        <w:rPr>
-          <w:lang w:val="pt-BR"/>
-        </w:rPr>
-        <w:t xml:space="preserve"> Pede o título se ausente, ou informa ausência na fonte.</w:t>
-      </w:r>
-    </w:p>
-    <w:p>
-      <w:pPr>
-        <w:numPr>
-          <w:ilvl w:val="0"/>
-          <w:numId w:val="11"/>
-        </w:numPr>
-        <w:rPr>
-          <w:lang w:val="pt-BR"/>
-        </w:rPr>
-      </w:pPr>
-      <w:proofErr w:type="spellStart"/>
-      <w:r>
-        <w:rPr>
-          <w:b/>
-          <w:bCs/>
-          <w:lang w:val="pt-BR"/>
-        </w:rPr>
-        <w:t>buscar_obras_autor</w:t>
-      </w:r>
-      <w:proofErr w:type="spellEnd"/>
-    </w:p>
-    <w:p>
-      <w:pPr>
-        <w:numPr>
-          <w:ilvl w:val="1"/>
-          <w:numId w:val="11"/>
-        </w:numPr>
-        <w:rPr>
-          <w:lang w:val="pt-BR"/>
-        </w:rPr>
-      </w:pPr>
-      <w:r>
-        <w:rPr>
-          <w:b/>
-          <w:bCs/>
-          <w:lang w:val="pt-BR"/>
-        </w:rPr>
-        <w:t>Objetivo:</w:t>
-      </w:r>
-      <w:r>
-        <w:rPr>
-          <w:lang w:val="pt-BR"/>
-        </w:rPr>
-        <w:t xml:space="preserve"> Listar obras atribuídas a um autor.</w:t>
-      </w:r>
-    </w:p>
-    <w:p>
-      <w:pPr>
-        <w:numPr>
-          <w:ilvl w:val="1"/>
-          <w:numId w:val="11"/>
-        </w:numPr>
-        <w:rPr>
-          <w:lang w:val="pt-BR"/>
-        </w:rPr>
-      </w:pPr>
-      <w:r>
-        <w:rPr>
-          <w:b/>
-          <w:bCs/>
-          <w:lang w:val="pt-BR"/>
-        </w:rPr>
-        <w:t>Ação:</w:t>
-      </w:r>
-      <w:r>
-        <w:rPr>
-          <w:lang w:val="pt-BR"/>
-        </w:rPr>
-        <w:t xml:space="preserve"> Consulta obras por autor na Open Library.</w:t>
-      </w:r>
-    </w:p>
-    <w:p>
-      <w:pPr>
-        <w:numPr>
-          <w:ilvl w:val="1"/>
-          <w:numId w:val="11"/>
-        </w:numPr>
-        <w:rPr>
-          <w:lang w:val="pt-BR"/>
-        </w:rPr>
-      </w:pPr>
-      <w:proofErr w:type="spellStart"/>
-      <w:r>
-        <w:rPr>
-          <w:b/>
-          <w:bCs/>
-          <w:lang w:val="pt-BR"/>
-        </w:rPr>
-        <w:t>Fallback</w:t>
-      </w:r>
-      <w:proofErr w:type="spellEnd"/>
-      <w:r>
-        <w:rPr>
-          <w:b/>
-          <w:bCs/>
-          <w:lang w:val="pt-BR"/>
-        </w:rPr>
-        <w:t>:</w:t>
-      </w:r>
-      <w:r>
-        <w:rPr>
-          <w:lang w:val="pt-BR"/>
-        </w:rPr>
-        <w:t xml:space="preserve"> Pede o nome completo se houver homônimos ou ambiguidade.</w:t>
-      </w:r>
-    </w:p>
-    <w:p>
-      <w:pPr>
-        <w:numPr>
-          <w:ilvl w:val="0"/>
-          <w:numId w:val="11"/>
-        </w:numPr>
-        <w:rPr>
-          <w:lang w:val="pt-BR"/>
-        </w:rPr>
-      </w:pPr>
-      <w:proofErr w:type="spellStart"/>
-      <w:r>
-        <w:rPr>
-          <w:b/>
-          <w:bCs/>
-          <w:lang w:val="pt-BR"/>
-        </w:rPr>
-        <w:t>buscar_por_assunto</w:t>
-      </w:r>
-      <w:proofErr w:type="spellEnd"/>
-    </w:p>
-    <w:p>
-      <w:pPr>
-        <w:numPr>
-          <w:ilvl w:val="1"/>
-          <w:numId w:val="11"/>
-        </w:numPr>
-        <w:rPr>
-          <w:lang w:val="pt-BR"/>
-        </w:rPr>
-      </w:pPr>
-      <w:r>
-        <w:rPr>
-          <w:b/>
-          <w:bCs/>
-          <w:lang w:val="pt-BR"/>
-        </w:rPr>
-        <w:t>Objetivo:</w:t>
-      </w:r>
-      <w:r>
-        <w:rPr>
-          <w:lang w:val="pt-BR"/>
-        </w:rPr>
-        <w:t xml:space="preserve"> Descobrir obras de um tema/gênero.</w:t>
-      </w:r>
-    </w:p>
-    <w:p>
-      <w:pPr>
-        <w:numPr>
-          <w:ilvl w:val="1"/>
-          <w:numId w:val="11"/>
-        </w:numPr>
-        <w:rPr>
-          <w:lang w:val="pt-BR"/>
-        </w:rPr>
-      </w:pPr>
-      <w:r>
-        <w:rPr>
-          <w:b/>
-          <w:bCs/>
-          <w:lang w:val="pt-BR"/>
-        </w:rPr>
-        <w:t>Ação:</w:t>
-      </w:r>
-      <w:r>
-        <w:rPr>
-          <w:lang w:val="pt-BR"/>
-        </w:rPr>
-        <w:t xml:space="preserve"> Consulta o assunto e apresenta obras relacionadas.</w:t>
-      </w:r>
-    </w:p>
-    <w:p>
-      <w:pPr>
-        <w:numPr>
-          <w:ilvl w:val="1"/>
-          <w:numId w:val="11"/>
-        </w:numPr>
-        <w:rPr>
-          <w:lang w:val="pt-BR"/>
-        </w:rPr>
-      </w:pPr>
-      <w:proofErr w:type="spellStart"/>
-      <w:r>
-        <w:rPr>
-          <w:b/>
-          <w:bCs/>
-          <w:lang w:val="pt-BR"/>
-        </w:rPr>
-        <w:t>Fallback</w:t>
-      </w:r>
-      <w:proofErr w:type="spellEnd"/>
-      <w:r>
-        <w:rPr>
-          <w:b/>
-          <w:bCs/>
-          <w:lang w:val="pt-BR"/>
-        </w:rPr>
-        <w:t>:</w:t>
-      </w:r>
-      <w:r>
-        <w:rPr>
-          <w:lang w:val="pt-BR"/>
-        </w:rPr>
-        <w:t xml:space="preserve"> Pede especificação caso o termo não seja encontrado.</w:t>
-      </w:r>
-    </w:p>
-    <w:p>
-      <w:pPr>
-        <w:numPr>
-          <w:ilvl w:val="0"/>
-          <w:numId w:val="11"/>
-        </w:numPr>
-        <w:rPr>
-          <w:lang w:val="pt-BR"/>
-        </w:rPr>
-      </w:pPr>
-      <w:proofErr w:type="spellStart"/>
-      <w:r>
-        <w:rPr>
-          <w:b/>
-          <w:bCs/>
-          <w:lang w:val="pt-BR"/>
-        </w:rPr>
-        <w:t>consultar_detalhes</w:t>
-      </w:r>
-      <w:proofErr w:type="spellEnd"/>
-    </w:p>
-    <w:p>
-      <w:pPr>
-        <w:numPr>
-          <w:ilvl w:val="1"/>
-          <w:numId w:val="11"/>
-        </w:numPr>
-        <w:rPr>
-          <w:lang w:val="pt-BR"/>
-        </w:rPr>
-      </w:pPr>
-      <w:r>
-        <w:rPr>
-          <w:b/>
-          <w:bCs/>
-          <w:lang w:val="pt-BR"/>
-        </w:rPr>
-        <w:t>Objetivo:</w:t>
-      </w:r>
-      <w:r>
-        <w:rPr>
-          <w:lang w:val="pt-BR"/>
-        </w:rPr>
-        <w:t xml:space="preserve"> Consultar obra/edição identificada.</w:t>
-      </w:r>
-    </w:p>
-    <w:p>
-      <w:pPr>
-        <w:numPr>
-          <w:ilvl w:val="1"/>
-          <w:numId w:val="11"/>
-        </w:numPr>
-        <w:rPr>
-          <w:lang w:val="pt-BR"/>
-        </w:rPr>
-      </w:pPr>
-      <w:r>
-        <w:rPr>
-          <w:b/>
-          <w:bCs/>
-          <w:lang w:val="pt-BR"/>
-        </w:rPr>
-        <w:t>Ação:</w:t>
-      </w:r>
-      <w:r>
-        <w:rPr>
-          <w:lang w:val="pt-BR"/>
-        </w:rPr>
-        <w:t xml:space="preserve"> Resolve a obra na sessão e mostra os campos disponíveis (como ISBN e ano).</w:t>
-      </w:r>
-    </w:p>
-    <w:p>
-      <w:pPr>
-        <w:numPr>
-          <w:ilvl w:val="1"/>
-          <w:numId w:val="11"/>
-        </w:numPr>
-        <w:rPr>
-          <w:lang w:val="pt-BR"/>
-        </w:rPr>
-      </w:pPr>
-      <w:proofErr w:type="spellStart"/>
-      <w:r>
-        <w:rPr>
-          <w:b/>
-          <w:bCs/>
-          <w:lang w:val="pt-BR"/>
-        </w:rPr>
-        <w:t>Fallback</w:t>
-      </w:r>
-      <w:proofErr w:type="spellEnd"/>
-      <w:r>
-        <w:rPr>
-          <w:b/>
-          <w:bCs/>
-          <w:lang w:val="pt-BR"/>
-        </w:rPr>
-        <w:t>:</w:t>
-      </w:r>
-      <w:r>
-        <w:rPr>
-          <w:lang w:val="pt-BR"/>
-        </w:rPr>
-        <w:t xml:space="preserve"> Pede para identificar a obra se o contexto estiver vazio.</w:t>
-      </w:r>
-    </w:p>
+    <w:p/>
     <w:p/>
     <w:sectPr>
       <w:footerReference w:type="default" r:id="rId17"/>
@@ -19233,7 +20124,7 @@
   <w:style w:type="paragraph" w:default="1" w:styleId="Normal">
     <w:name w:val="Normal"/>
     <w:qFormat/>
-    <w:rsid w:val="00FC693F"/>
+    <w:rsid w:val="001436BF"/>
     <w:pPr>
       <w:spacing w:after="80" w:line="252" w:lineRule="auto"/>
     </w:pPr>
@@ -19456,6 +20347,7 @@
   <w:style w:type="character" w:default="1" w:styleId="Fontepargpadro">
     <w:name w:val="Default Paragraph Font"/>
     <w:uiPriority w:val="1"/>
+    <w:semiHidden/>
     <w:unhideWhenUsed/>
   </w:style>
   <w:style w:type="table" w:default="1" w:styleId="Tabelanormal">
@@ -30234,6 +31126,19 @@
       </w:tcPr>
     </w:tblStylePr>
   </w:style>
+  <w:style w:type="character" w:styleId="CdigoHTML">
+    <w:name w:val="HTML Code"/>
+    <w:basedOn w:val="Fontepargpadro"/>
+    <w:uiPriority w:val="99"/>
+    <w:semiHidden/>
+    <w:unhideWhenUsed/>
+    <w:rsid w:val="004F3729"/>
+    <w:rPr>
+      <w:rFonts w:ascii="Courier New" w:eastAsia="Times New Roman" w:hAnsi="Courier New" w:cs="Courier New"/>
+      <w:sz w:val="20"/>
+      <w:szCs w:val="20"/>
+    </w:rPr>
+  </w:style>
 </w:styles>
 </file>
 

</xml_diff>